<commit_message>
Remove draft line from copyeditor notes; regenerate docx
</commit_message>
<xml_diff>
--- a/production/manuscript-status-notes.docx
+++ b/production/manuscript-status-notes.docx
@@ -19,18 +19,6 @@
           <w:i/>
         </w:rPr>
         <w:t xml:space="preserve">Visualizing Multivariate Data and Models in R</w:t>
-      </w:r>
-    </w:p>
-    <w:p>
-      <w:pPr>
-        <w:pStyle w:val="FirstParagraph"/>
-      </w:pPr>
-      <w:r>
-        <w:rPr>
-          <w:iCs/>
-          <w:i/>
-        </w:rPr>
-        <w:t xml:space="preserve">Draft — 2026-07-10. To be finalized (page count, date) against the actual PDF sent.</w:t>
       </w:r>
     </w:p>
     <w:p>

</xml_diff>